<commit_message>
dbms and cn added
</commit_message>
<xml_diff>
--- a/4th semester/DBMS/Lab 1.docx
+++ b/4th semester/DBMS/Lab 1.docx
@@ -9,10 +9,21 @@
         <w:rPr>
           <w:sz w:val="32"/>
           <w:szCs w:val="32"/>
+          <w:rtl w:val="0"/>
         </w:rPr>
       </w:pPr>
       <w:bookmarkStart w:id="0" w:name="_tyuuwnchuhe" w:colFirst="0" w:colLast="0"/>
       <w:bookmarkEnd w:id="0"/>
+    </w:p>
+    <w:p>
+      <w:pPr>
+        <w:pStyle w:val="3"/>
+        <w:jc w:val="center"/>
+        <w:rPr>
+          <w:sz w:val="32"/>
+          <w:szCs w:val="32"/>
+        </w:rPr>
+      </w:pPr>
       <w:r>
         <w:rPr>
           <w:sz w:val="32"/>
@@ -378,6 +389,8 @@
       <w:pPr>
         <w:bidi w:val="0"/>
       </w:pPr>
+      <w:bookmarkStart w:id="2" w:name="_GoBack"/>
+      <w:bookmarkEnd w:id="2"/>
     </w:p>
     <w:p>
       <w:pPr>
@@ -394,6 +407,15 @@
         </w:rPr>
         <w:t>Common symbols used in ER diagrams:</w:t>
       </w:r>
+    </w:p>
+    <w:p>
+      <w:pPr>
+        <w:bidi w:val="0"/>
+        <w:rPr>
+          <w:b/>
+          <w:bCs/>
+        </w:rPr>
+      </w:pPr>
     </w:p>
     <w:p>
       <w:pPr>
@@ -402,7 +424,7 @@
         <w:widowControl/>
         <w:suppressLineNumbers w:val="0"/>
         <w:ind w:firstLine="720" w:firstLineChars="0"/>
-        <w:jc w:val="left"/>
+        <w:jc w:val="both"/>
       </w:pPr>
       <w:r>
         <w:rPr>
@@ -414,8 +436,8 @@
         </w:rPr>
         <w:drawing>
           <wp:inline distT="0" distB="0" distL="114300" distR="114300">
-            <wp:extent cx="5019675" cy="3932555"/>
-            <wp:effectExtent l="0" t="0" r="9525" b="10795"/>
+            <wp:extent cx="5383530" cy="4217670"/>
+            <wp:effectExtent l="0" t="0" r="7620" b="11430"/>
             <wp:docPr id="1" name="Picture 1" descr="IMG_256"/>
             <wp:cNvGraphicFramePr>
               <a:graphicFrameLocks xmlns:a="http://schemas.openxmlformats.org/drawingml/2006/main" noChangeAspect="1"/>
@@ -438,7 +460,7 @@
                   <pic:spPr>
                     <a:xfrm>
                       <a:off x="0" y="0"/>
-                      <a:ext cx="5019675" cy="3932555"/>
+                      <a:ext cx="5383530" cy="4217670"/>
                     </a:xfrm>
                     <a:prstGeom prst="rect">
                       <a:avLst/>
@@ -496,42 +518,14 @@
           <w:lang w:val="en-US"/>
         </w:rPr>
       </w:pPr>
-      <w:bookmarkStart w:id="2" w:name="_GoBack"/>
-      <w:bookmarkEnd w:id="2"/>
-      <w:r>
+    </w:p>
+    <w:p>
+      <w:pPr>
         <w:rPr>
           <w:rFonts w:hint="default"/>
           <w:lang w:val="en-US"/>
         </w:rPr>
-        <w:t>ER DIAGRAMS:</w:t>
-      </w:r>
-    </w:p>
-    <w:p>
-      <w:pPr>
-        <w:bidi w:val="0"/>
-      </w:pPr>
-    </w:p>
-    <w:p>
-      <w:pPr>
-        <w:numPr>
-          <w:ilvl w:val="0"/>
-          <w:numId w:val="3"/>
-        </w:numPr>
-        <w:bidi w:val="0"/>
-        <w:rPr>
-          <w:szCs w:val="28"/>
-          <w:shd w:val="clear" w:color="auto" w:fill="auto"/>
-        </w:rPr>
-      </w:pPr>
-      <w:r>
-        <w:rPr>
-          <w:rFonts w:hint="default"/>
-          <w:szCs w:val="28"/>
-          <w:shd w:val="clear" w:color="auto" w:fill="auto"/>
-          <w:lang w:val="en-US"/>
-        </w:rPr>
-        <w:t xml:space="preserve">Library system: </w:t>
-      </w:r>
+      </w:pPr>
     </w:p>
     <w:p>
       <w:pPr>
@@ -619,12 +613,21 @@
           <w:numId w:val="0"/>
         </w:numPr>
         <w:bidi w:val="0"/>
-        <w:ind w:leftChars="0" w:firstLine="720" w:firstLineChars="0"/>
+        <w:jc w:val="center"/>
         <w:rPr>
           <w:szCs w:val="28"/>
           <w:shd w:val="clear" w:color="auto" w:fill="auto"/>
         </w:rPr>
       </w:pPr>
+      <w:r>
+        <w:rPr>
+          <w:rFonts w:hint="default"/>
+          <w:szCs w:val="28"/>
+          <w:shd w:val="clear" w:color="auto" w:fill="auto"/>
+          <w:lang w:val="en-US"/>
+        </w:rPr>
+        <w:t>Fig: ER diagram of Library System</w:t>
+      </w:r>
     </w:p>
     <w:p>
       <w:pPr>
@@ -633,7 +636,6 @@
           <w:numId w:val="0"/>
         </w:numPr>
         <w:bidi w:val="0"/>
-        <w:ind w:leftChars="0" w:firstLine="720" w:firstLineChars="0"/>
         <w:rPr>
           <w:szCs w:val="28"/>
           <w:shd w:val="clear" w:color="auto" w:fill="auto"/>
@@ -657,25 +659,15 @@
     <w:p>
       <w:pPr>
         <w:numPr>
-          <w:ilvl w:val="0"/>
-          <w:numId w:val="3"/>
+          <w:numId w:val="0"/>
         </w:numPr>
         <w:bidi w:val="0"/>
-        <w:ind w:left="0" w:leftChars="0" w:firstLine="0" w:firstLineChars="0"/>
+        <w:ind w:leftChars="0"/>
         <w:rPr>
           <w:szCs w:val="28"/>
           <w:shd w:val="clear" w:color="auto" w:fill="auto"/>
         </w:rPr>
       </w:pPr>
-      <w:r>
-        <w:rPr>
-          <w:rFonts w:hint="default"/>
-          <w:szCs w:val="28"/>
-          <w:shd w:val="clear" w:color="auto" w:fill="auto"/>
-          <w:lang w:val="en-US"/>
-        </w:rPr>
-        <w:t>Online Store:</w:t>
-      </w:r>
     </w:p>
     <w:p>
       <w:pPr>
@@ -759,61 +751,94 @@
     </w:p>
     <w:p>
       <w:pPr>
+        <w:jc w:val="center"/>
+        <w:rPr>
+          <w:szCs w:val="28"/>
+          <w:shd w:val="clear" w:color="auto" w:fill="auto"/>
+        </w:rPr>
+      </w:pPr>
+      <w:r>
+        <w:rPr>
+          <w:rFonts w:hint="default"/>
+          <w:szCs w:val="28"/>
+          <w:shd w:val="clear" w:color="auto" w:fill="auto"/>
+          <w:lang w:val="en-US"/>
+        </w:rPr>
+        <w:t>Fig: ER Diagram of Online Store</w:t>
+      </w:r>
+    </w:p>
+    <w:p>
+      <w:pPr>
+        <w:rPr>
+          <w:szCs w:val="28"/>
+          <w:shd w:val="clear" w:color="auto" w:fill="auto"/>
+        </w:rPr>
+      </w:pPr>
+      <w:r>
+        <w:rPr>
+          <w:szCs w:val="28"/>
+          <w:shd w:val="clear" w:color="auto" w:fill="auto"/>
+        </w:rPr>
+        <w:br w:type="page"/>
+      </w:r>
+    </w:p>
+    <w:p>
+      <w:pPr>
+        <w:rPr>
+          <w:szCs w:val="28"/>
+          <w:shd w:val="clear" w:color="auto" w:fill="auto"/>
+        </w:rPr>
+      </w:pPr>
+    </w:p>
+    <w:p>
+      <w:pPr>
+        <w:numPr>
+          <w:numId w:val="0"/>
+        </w:numPr>
+        <w:bidi w:val="0"/>
+        <w:ind w:leftChars="0"/>
+        <w:rPr>
+          <w:szCs w:val="28"/>
+          <w:shd w:val="clear" w:color="auto" w:fill="auto"/>
+        </w:rPr>
+      </w:pPr>
+    </w:p>
+    <w:p>
+      <w:pPr>
+        <w:pStyle w:val="3"/>
+        <w:bidi w:val="0"/>
+        <w:rPr>
+          <w:rFonts w:hint="default"/>
+          <w:sz w:val="28"/>
+          <w:szCs w:val="28"/>
+          <w:shd w:val="clear" w:color="auto" w:fill="auto"/>
+          <w:lang w:val="en-US"/>
+        </w:rPr>
+      </w:pPr>
+      <w:r>
+        <w:rPr>
+          <w:sz w:val="28"/>
+          <w:szCs w:val="28"/>
+          <w:shd w:val="clear" w:color="auto" w:fill="auto"/>
+        </w:rPr>
+        <w:t xml:space="preserve">DESCRIPTION OF </w:t>
+      </w:r>
+      <w:r>
+        <w:rPr>
+          <w:rFonts w:hint="default"/>
+          <w:sz w:val="28"/>
+          <w:szCs w:val="28"/>
+          <w:shd w:val="clear" w:color="auto" w:fill="auto"/>
+          <w:lang w:val="en-US"/>
+        </w:rPr>
+        <w:t>MODEL:</w:t>
+      </w:r>
+    </w:p>
+    <w:p>
+      <w:pPr>
         <w:numPr>
           <w:ilvl w:val="0"/>
           <w:numId w:val="3"/>
-        </w:numPr>
-        <w:bidi w:val="0"/>
-        <w:ind w:left="0" w:leftChars="0" w:firstLine="0" w:firstLineChars="0"/>
-        <w:rPr>
-          <w:szCs w:val="28"/>
-          <w:shd w:val="clear" w:color="auto" w:fill="auto"/>
-        </w:rPr>
-      </w:pPr>
-      <w:r>
-        <w:rPr>
-          <w:szCs w:val="28"/>
-          <w:shd w:val="clear" w:color="auto" w:fill="auto"/>
-        </w:rPr>
-        <w:br w:type="page"/>
-      </w:r>
-    </w:p>
-    <w:p>
-      <w:pPr>
-        <w:pStyle w:val="3"/>
-        <w:bidi w:val="0"/>
-        <w:rPr>
-          <w:rFonts w:hint="default"/>
-          <w:sz w:val="28"/>
-          <w:szCs w:val="28"/>
-          <w:shd w:val="clear" w:color="auto" w:fill="auto"/>
-          <w:lang w:val="en-US"/>
-        </w:rPr>
-      </w:pPr>
-      <w:r>
-        <w:rPr>
-          <w:sz w:val="28"/>
-          <w:szCs w:val="28"/>
-          <w:shd w:val="clear" w:color="auto" w:fill="auto"/>
-        </w:rPr>
-        <w:t xml:space="preserve">DESCRIPTION OF </w:t>
-      </w:r>
-      <w:r>
-        <w:rPr>
-          <w:rFonts w:hint="default"/>
-          <w:sz w:val="28"/>
-          <w:szCs w:val="28"/>
-          <w:shd w:val="clear" w:color="auto" w:fill="auto"/>
-          <w:lang w:val="en-US"/>
-        </w:rPr>
-        <w:t>MODEL:</w:t>
-      </w:r>
-    </w:p>
-    <w:p>
-      <w:pPr>
-        <w:numPr>
-          <w:ilvl w:val="0"/>
-          <w:numId w:val="4"/>
         </w:numPr>
         <w:rPr>
           <w:rFonts w:hint="default"/>
@@ -855,7 +880,7 @@
       <w:pPr>
         <w:numPr>
           <w:ilvl w:val="0"/>
-          <w:numId w:val="4"/>
+          <w:numId w:val="3"/>
         </w:numPr>
         <w:bidi w:val="0"/>
         <w:ind w:left="0" w:leftChars="0" w:firstLine="0" w:firstLineChars="0"/>
@@ -1079,138 +1104,6 @@
     </w:lvl>
   </w:abstractNum>
   <w:abstractNum w:abstractNumId="1">
-    <w:nsid w:val="F733D0BB"/>
-    <w:multiLevelType w:val="multilevel"/>
-    <w:tmpl w:val="F733D0BB"/>
-    <w:lvl w:ilvl="0" w:tentative="0">
-      <w:start w:val="1"/>
-      <w:numFmt w:val="decimal"/>
-      <w:suff w:val="space"/>
-      <w:lvlText w:val="%1."/>
-      <w:lvlJc w:val="left"/>
-    </w:lvl>
-    <w:lvl w:ilvl="1" w:tentative="0">
-      <w:start w:val="1"/>
-      <w:numFmt w:val="lowerLetter"/>
-      <w:lvlText w:val="%2)"/>
-      <w:lvlJc w:val="left"/>
-      <w:pPr>
-        <w:tabs>
-          <w:tab w:val="left" w:pos="840"/>
-        </w:tabs>
-        <w:ind w:left="840" w:leftChars="0" w:hanging="420" w:firstLineChars="0"/>
-      </w:pPr>
-      <w:rPr>
-        <w:rFonts w:hint="default"/>
-      </w:rPr>
-    </w:lvl>
-    <w:lvl w:ilvl="2" w:tentative="0">
-      <w:start w:val="1"/>
-      <w:numFmt w:val="lowerRoman"/>
-      <w:lvlText w:val="%3."/>
-      <w:lvlJc w:val="left"/>
-      <w:pPr>
-        <w:tabs>
-          <w:tab w:val="left" w:pos="1260"/>
-        </w:tabs>
-        <w:ind w:left="1260" w:leftChars="0" w:hanging="420" w:firstLineChars="0"/>
-      </w:pPr>
-      <w:rPr>
-        <w:rFonts w:hint="default"/>
-      </w:rPr>
-    </w:lvl>
-    <w:lvl w:ilvl="3" w:tentative="0">
-      <w:start w:val="1"/>
-      <w:numFmt w:val="decimal"/>
-      <w:lvlText w:val="%4."/>
-      <w:lvlJc w:val="left"/>
-      <w:pPr>
-        <w:tabs>
-          <w:tab w:val="left" w:pos="1680"/>
-        </w:tabs>
-        <w:ind w:left="1680" w:leftChars="0" w:hanging="420" w:firstLineChars="0"/>
-      </w:pPr>
-      <w:rPr>
-        <w:rFonts w:hint="default"/>
-      </w:rPr>
-    </w:lvl>
-    <w:lvl w:ilvl="4" w:tentative="0">
-      <w:start w:val="1"/>
-      <w:numFmt w:val="lowerLetter"/>
-      <w:lvlText w:val="%5)"/>
-      <w:lvlJc w:val="left"/>
-      <w:pPr>
-        <w:tabs>
-          <w:tab w:val="left" w:pos="2100"/>
-        </w:tabs>
-        <w:ind w:left="2100" w:leftChars="0" w:hanging="420" w:firstLineChars="0"/>
-      </w:pPr>
-      <w:rPr>
-        <w:rFonts w:hint="default"/>
-      </w:rPr>
-    </w:lvl>
-    <w:lvl w:ilvl="5" w:tentative="0">
-      <w:start w:val="1"/>
-      <w:numFmt w:val="lowerRoman"/>
-      <w:lvlText w:val="%6."/>
-      <w:lvlJc w:val="left"/>
-      <w:pPr>
-        <w:tabs>
-          <w:tab w:val="left" w:pos="2520"/>
-        </w:tabs>
-        <w:ind w:left="2520" w:leftChars="0" w:hanging="420" w:firstLineChars="0"/>
-      </w:pPr>
-      <w:rPr>
-        <w:rFonts w:hint="default"/>
-      </w:rPr>
-    </w:lvl>
-    <w:lvl w:ilvl="6" w:tentative="0">
-      <w:start w:val="1"/>
-      <w:numFmt w:val="decimal"/>
-      <w:lvlText w:val="%7."/>
-      <w:lvlJc w:val="left"/>
-      <w:pPr>
-        <w:tabs>
-          <w:tab w:val="left" w:pos="2940"/>
-        </w:tabs>
-        <w:ind w:left="2940" w:leftChars="0" w:hanging="420" w:firstLineChars="0"/>
-      </w:pPr>
-      <w:rPr>
-        <w:rFonts w:hint="default"/>
-      </w:rPr>
-    </w:lvl>
-    <w:lvl w:ilvl="7" w:tentative="0">
-      <w:start w:val="1"/>
-      <w:numFmt w:val="lowerLetter"/>
-      <w:lvlText w:val="%8)"/>
-      <w:lvlJc w:val="left"/>
-      <w:pPr>
-        <w:tabs>
-          <w:tab w:val="left" w:pos="3360"/>
-        </w:tabs>
-        <w:ind w:left="3360" w:leftChars="0" w:hanging="420" w:firstLineChars="0"/>
-      </w:pPr>
-      <w:rPr>
-        <w:rFonts w:hint="default"/>
-      </w:rPr>
-    </w:lvl>
-    <w:lvl w:ilvl="8" w:tentative="0">
-      <w:start w:val="1"/>
-      <w:numFmt w:val="lowerRoman"/>
-      <w:lvlText w:val="%9."/>
-      <w:lvlJc w:val="left"/>
-      <w:pPr>
-        <w:tabs>
-          <w:tab w:val="left" w:pos="3780"/>
-        </w:tabs>
-        <w:ind w:left="3780" w:leftChars="0" w:hanging="420" w:firstLineChars="0"/>
-      </w:pPr>
-      <w:rPr>
-        <w:rFonts w:hint="default"/>
-      </w:rPr>
-    </w:lvl>
-  </w:abstractNum>
-  <w:abstractNum w:abstractNumId="2">
     <w:nsid w:val="17975581"/>
     <w:multiLevelType w:val="singleLevel"/>
     <w:tmpl w:val="17975581"/>
@@ -1222,7 +1115,7 @@
       <w:lvlJc w:val="left"/>
     </w:lvl>
   </w:abstractNum>
-  <w:abstractNum w:abstractNumId="3">
+  <w:abstractNum w:abstractNumId="2">
     <w:nsid w:val="469941A5"/>
     <w:multiLevelType w:val="singleLevel"/>
     <w:tmpl w:val="469941A5"/>
@@ -1235,16 +1128,13 @@
     </w:lvl>
   </w:abstractNum>
   <w:num w:numId="1">
-    <w:abstractNumId w:val="3"/>
+    <w:abstractNumId w:val="2"/>
   </w:num>
   <w:num w:numId="2">
     <w:abstractNumId w:val="0"/>
   </w:num>
   <w:num w:numId="3">
     <w:abstractNumId w:val="1"/>
-  </w:num>
-  <w:num w:numId="4">
-    <w:abstractNumId w:val="2"/>
   </w:num>
 </w:numbering>
 </file>
@@ -1264,9 +1154,9 @@
     <w:lsdException w:qFormat="1" w:unhideWhenUsed="0" w:uiPriority="0" w:semiHidden="0" w:name="heading 1"/>
     <w:lsdException w:qFormat="1" w:unhideWhenUsed="0" w:uiPriority="0" w:semiHidden="0" w:name="heading 2"/>
     <w:lsdException w:qFormat="1" w:unhideWhenUsed="0" w:uiPriority="0" w:semiHidden="0" w:name="heading 3"/>
-    <w:lsdException w:unhideWhenUsed="0" w:uiPriority="0" w:semiHidden="0" w:name="heading 4"/>
-    <w:lsdException w:unhideWhenUsed="0" w:uiPriority="0" w:semiHidden="0" w:name="heading 5"/>
-    <w:lsdException w:unhideWhenUsed="0" w:uiPriority="0" w:semiHidden="0" w:name="heading 6"/>
+    <w:lsdException w:qFormat="1" w:unhideWhenUsed="0" w:uiPriority="0" w:semiHidden="0" w:name="heading 4"/>
+    <w:lsdException w:qFormat="1" w:unhideWhenUsed="0" w:uiPriority="0" w:semiHidden="0" w:name="heading 5"/>
+    <w:lsdException w:qFormat="1" w:unhideWhenUsed="0" w:uiPriority="0" w:semiHidden="0" w:name="heading 6"/>
     <w:lsdException w:qFormat="1" w:uiPriority="0" w:name="heading 7"/>
     <w:lsdException w:qFormat="1" w:uiPriority="0" w:name="heading 8"/>
     <w:lsdException w:qFormat="1" w:uiPriority="0" w:name="heading 9"/>
@@ -1322,10 +1212,10 @@
     <w:lsdException w:unhideWhenUsed="0" w:uiPriority="0" w:semiHidden="0" w:name="List Number 3"/>
     <w:lsdException w:unhideWhenUsed="0" w:uiPriority="0" w:semiHidden="0" w:name="List Number 4"/>
     <w:lsdException w:unhideWhenUsed="0" w:uiPriority="0" w:semiHidden="0" w:name="List Number 5"/>
-    <w:lsdException w:unhideWhenUsed="0" w:uiPriority="0" w:semiHidden="0" w:name="Title"/>
+    <w:lsdException w:qFormat="1" w:unhideWhenUsed="0" w:uiPriority="0" w:semiHidden="0" w:name="Title"/>
     <w:lsdException w:unhideWhenUsed="0" w:uiPriority="0" w:semiHidden="0" w:name="Closing"/>
     <w:lsdException w:unhideWhenUsed="0" w:uiPriority="0" w:semiHidden="0" w:name="Signature"/>
-    <w:lsdException w:unhideWhenUsed="0" w:uiPriority="0" w:name="Default Paragraph Font"/>
+    <w:lsdException w:qFormat="1" w:unhideWhenUsed="0" w:uiPriority="0" w:name="Default Paragraph Font"/>
     <w:lsdException w:unhideWhenUsed="0" w:uiPriority="0" w:semiHidden="0" w:name="Body Text"/>
     <w:lsdException w:unhideWhenUsed="0" w:uiPriority="0" w:semiHidden="0" w:name="Body Text Indent"/>
     <w:lsdException w:unhideWhenUsed="0" w:uiPriority="0" w:semiHidden="0" w:name="List Continue"/>
@@ -1334,7 +1224,7 @@
     <w:lsdException w:unhideWhenUsed="0" w:uiPriority="0" w:semiHidden="0" w:name="List Continue 4"/>
     <w:lsdException w:unhideWhenUsed="0" w:uiPriority="0" w:semiHidden="0" w:name="List Continue 5"/>
     <w:lsdException w:unhideWhenUsed="0" w:uiPriority="0" w:semiHidden="0" w:name="Message Header"/>
-    <w:lsdException w:unhideWhenUsed="0" w:uiPriority="0" w:semiHidden="0" w:name="Subtitle"/>
+    <w:lsdException w:qFormat="1" w:unhideWhenUsed="0" w:uiPriority="0" w:semiHidden="0" w:name="Subtitle"/>
     <w:lsdException w:unhideWhenUsed="0" w:uiPriority="0" w:semiHidden="0" w:name="Salutation"/>
     <w:lsdException w:unhideWhenUsed="0" w:uiPriority="0" w:semiHidden="0" w:name="Date"/>
     <w:lsdException w:unhideWhenUsed="0" w:uiPriority="0" w:semiHidden="0" w:name="Body Text First Indent"/>
@@ -1352,7 +1242,7 @@
     <w:lsdException w:unhideWhenUsed="0" w:uiPriority="0" w:semiHidden="0" w:name="Document Map"/>
     <w:lsdException w:unhideWhenUsed="0" w:uiPriority="0" w:semiHidden="0" w:name="Plain Text"/>
     <w:lsdException w:unhideWhenUsed="0" w:uiPriority="0" w:semiHidden="0" w:name="E-mail Signature"/>
-    <w:lsdException w:unhideWhenUsed="0" w:uiPriority="0" w:semiHidden="0" w:name="Normal (Web)"/>
+    <w:lsdException w:qFormat="1" w:unhideWhenUsed="0" w:uiPriority="0" w:semiHidden="0" w:name="Normal (Web)"/>
     <w:lsdException w:unhideWhenUsed="0" w:uiPriority="0" w:semiHidden="0" w:name="HTML Acronym"/>
     <w:lsdException w:unhideWhenUsed="0" w:uiPriority="0" w:semiHidden="0" w:name="HTML Address"/>
     <w:lsdException w:unhideWhenUsed="0" w:uiPriority="0" w:semiHidden="0" w:name="HTML Cite"/>
@@ -1363,7 +1253,7 @@
     <w:lsdException w:unhideWhenUsed="0" w:uiPriority="0" w:semiHidden="0" w:name="HTML Sample"/>
     <w:lsdException w:unhideWhenUsed="0" w:uiPriority="0" w:semiHidden="0" w:name="HTML Typewriter"/>
     <w:lsdException w:unhideWhenUsed="0" w:uiPriority="0" w:semiHidden="0" w:name="HTML Variable"/>
-    <w:lsdException w:unhideWhenUsed="0" w:uiPriority="0" w:name="Normal Table"/>
+    <w:lsdException w:qFormat="1" w:unhideWhenUsed="0" w:uiPriority="0" w:name="Normal Table"/>
     <w:lsdException w:unhideWhenUsed="0" w:uiPriority="0" w:semiHidden="0" w:name="annotation subject"/>
     <w:lsdException w:unhideWhenUsed="0" w:uiPriority="0" w:semiHidden="0" w:name="Table Simple 1"/>
     <w:lsdException w:unhideWhenUsed="0" w:uiPriority="0" w:semiHidden="0" w:name="Table Simple 2"/>
@@ -1612,6 +1502,7 @@
     <w:name w:val="heading 4"/>
     <w:basedOn w:val="1"/>
     <w:next w:val="1"/>
+    <w:qFormat/>
     <w:uiPriority w:val="0"/>
     <w:pPr>
       <w:keepNext w:val="0"/>
@@ -1645,6 +1536,7 @@
     <w:name w:val="heading 5"/>
     <w:basedOn w:val="1"/>
     <w:next w:val="1"/>
+    <w:qFormat/>
     <w:uiPriority w:val="0"/>
     <w:pPr>
       <w:keepNext/>
@@ -1662,6 +1554,7 @@
     <w:name w:val="heading 6"/>
     <w:basedOn w:val="1"/>
     <w:next w:val="1"/>
+    <w:qFormat/>
     <w:uiPriority w:val="0"/>
     <w:pPr>
       <w:keepNext/>
@@ -1678,11 +1571,13 @@
   <w:style w:type="character" w:default="1" w:styleId="8">
     <w:name w:val="Default Paragraph Font"/>
     <w:semiHidden/>
+    <w:qFormat/>
     <w:uiPriority w:val="0"/>
   </w:style>
   <w:style w:type="table" w:default="1" w:styleId="9">
     <w:name w:val="Normal Table"/>
     <w:semiHidden/>
+    <w:qFormat/>
     <w:uiPriority w:val="0"/>
     <w:tblPr>
       <w:tblCellMar>
@@ -1695,6 +1590,7 @@
   </w:style>
   <w:style w:type="paragraph" w:styleId="10">
     <w:name w:val="Normal (Web)"/>
+    <w:qFormat/>
     <w:uiPriority w:val="0"/>
     <w:pPr>
       <w:spacing w:before="0" w:beforeAutospacing="1" w:after="0" w:afterAutospacing="1"/>
@@ -1723,6 +1619,7 @@
     <w:name w:val="Subtitle"/>
     <w:basedOn w:val="1"/>
     <w:next w:val="1"/>
+    <w:qFormat/>
     <w:uiPriority w:val="0"/>
     <w:pPr>
       <w:keepNext/>
@@ -1742,6 +1639,7 @@
     <w:name w:val="Title"/>
     <w:basedOn w:val="1"/>
     <w:next w:val="1"/>
+    <w:qFormat/>
     <w:uiPriority w:val="0"/>
     <w:pPr>
       <w:keepNext/>
@@ -1763,6 +1661,7 @@
   <w:style w:type="character" w:customStyle="1" w:styleId="15">
     <w:name w:val="Heading 2 Char"/>
     <w:link w:val="3"/>
+    <w:qFormat/>
     <w:uiPriority w:val="0"/>
     <w:rPr>
       <w:rFonts w:ascii="Times New Roman" w:hAnsi="Times New Roman" w:eastAsia="Times New Roman" w:cs="Times New Roman"/>

</xml_diff>